<commit_message>
Mindne hibás, visszaállni egy korábbi verzióra.
</commit_message>
<xml_diff>
--- a/BiztvillCRM.Web/wwwroot/sablonok/VBF_KIF_MINTA.docx
+++ b/BiztvillCRM.Web/wwwroot/sablonok/VBF_KIF_MINTA.docx
@@ -4598,7 +4598,6 @@
               </w:rPr>
               <w:t xml:space="preserve"> </w:t>
             </w:r>
-            <w:proofErr w:type="gramStart"/>
             <w:r>
               <w:rPr>
                 <w:rFonts w:eastAsia="Arial" w:cs="Segoe UI"/>
@@ -4607,7 +4606,6 @@
               </w:rPr>
               <w:t>A</w:t>
             </w:r>
-            <w:proofErr w:type="gramEnd"/>
             <w:r>
               <w:rPr>
                 <w:rFonts w:eastAsia="Arial" w:cs="Segoe UI"/>
@@ -4842,17 +4840,16 @@
                 <w:sz w:val="24"/>
                 <w:szCs w:val="24"/>
               </w:rPr>
-              <w:t>{{MF_X}</w:t>
-            </w:r>
-            <w:proofErr w:type="gramStart"/>
-            <w:r>
-              <w:rPr>
-                <w:rFonts w:ascii="Segoe UI" w:hAnsi="Segoe UI" w:cs="Segoe UI"/>
+              <w:t>{{MF_X}}</w:t>
+            </w:r>
+            <w:r>
+              <w:rPr>
+                <w:rFonts w:cstheme="minorHAnsi"/>
                 <w:b/>
                 <w:sz w:val="24"/>
                 <w:szCs w:val="24"/>
               </w:rPr>
-              <w:t>}</w:t>
+              <w:t xml:space="preserve"> </w:t>
             </w:r>
             <w:r>
               <w:rPr>
@@ -4861,7 +4858,7 @@
                 <w:sz w:val="24"/>
                 <w:szCs w:val="24"/>
               </w:rPr>
-              <w:t xml:space="preserve"> </w:t>
+              <w:t xml:space="preserve">   </w:t>
             </w:r>
             <w:r>
               <w:rPr>
@@ -4870,7 +4867,7 @@
                 <w:sz w:val="24"/>
                 <w:szCs w:val="24"/>
               </w:rPr>
-              <w:t xml:space="preserve">   </w:t>
+              <w:t>MEGFELEL</w:t>
             </w:r>
             <w:r>
               <w:rPr>
@@ -4879,18 +4876,8 @@
                 <w:sz w:val="24"/>
                 <w:szCs w:val="24"/>
               </w:rPr>
-              <w:t>MEGFELEL</w:t>
-            </w:r>
-            <w:r>
-              <w:rPr>
-                <w:rFonts w:cstheme="minorHAnsi"/>
-                <w:b/>
-                <w:sz w:val="24"/>
-                <w:szCs w:val="24"/>
-              </w:rPr>
               <w:t>T</w:t>
             </w:r>
-            <w:proofErr w:type="gramEnd"/>
           </w:p>
         </w:tc>
         <w:tc>
@@ -5332,25 +5319,7 @@
                 <w:sz w:val="24"/>
                 <w:szCs w:val="22"/>
               </w:rPr>
-              <w:t xml:space="preserve"> </w:t>
-            </w:r>
-            <w:proofErr w:type="gramStart"/>
-            <w:r>
-              <w:rPr>
-                <w:rFonts w:eastAsia="Arial" w:cs="Segoe UI"/>
-                <w:sz w:val="24"/>
-                <w:szCs w:val="22"/>
-              </w:rPr>
-              <w:t>A</w:t>
-            </w:r>
-            <w:proofErr w:type="gramEnd"/>
-            <w:r>
-              <w:rPr>
-                <w:rFonts w:eastAsia="Arial" w:cs="Segoe UI"/>
-                <w:sz w:val="24"/>
-                <w:szCs w:val="22"/>
-              </w:rPr>
-              <w:t xml:space="preserve"> szokásos karbantartások során célszerű a következő hibákat kijavítani:</w:t>
+              <w:t xml:space="preserve"> A szokásos karbantartások során célszerű a következő hibákat kijavítani:</w:t>
             </w:r>
           </w:p>
         </w:tc>
@@ -7740,9 +7709,8 @@
                 <w:sz w:val="24"/>
                 <w:szCs w:val="22"/>
               </w:rPr>
-              <w:t>Mellékletek száma</w:t>
-            </w:r>
-            <w:proofErr w:type="gramStart"/>
+              <w:t xml:space="preserve">Mellékletek száma: </w:t>
+            </w:r>
             <w:r>
               <w:rPr>
                 <w:rFonts w:eastAsia="Arial" w:cs="Segoe UI"/>
@@ -7751,7 +7719,7 @@
                 <w:sz w:val="24"/>
                 <w:szCs w:val="22"/>
               </w:rPr>
-              <w:t xml:space="preserve">: </w:t>
+              <w:t xml:space="preserve"> </w:t>
             </w:r>
             <w:r>
               <w:rPr>
@@ -7761,41 +7729,8 @@
                 <w:sz w:val="24"/>
                 <w:szCs w:val="22"/>
               </w:rPr>
-              <w:t xml:space="preserve"> </w:t>
-            </w:r>
-            <w:r>
-              <w:rPr>
-                <w:rFonts w:eastAsia="Arial" w:cs="Segoe UI"/>
-                <w:i/>
-                <w:spacing w:val="-3"/>
-                <w:sz w:val="24"/>
-                <w:szCs w:val="22"/>
-              </w:rPr>
-              <w:t>{</w:t>
-            </w:r>
-            <w:proofErr w:type="gramEnd"/>
-            <w:r>
-              <w:rPr>
-                <w:rFonts w:eastAsia="Arial" w:cs="Segoe UI"/>
-                <w:i/>
-                <w:spacing w:val="-3"/>
-                <w:sz w:val="24"/>
-                <w:szCs w:val="22"/>
-              </w:rPr>
-              <w:t>{</w:t>
-            </w:r>
-            <w:proofErr w:type="spellStart"/>
-            <w:r>
-              <w:rPr>
-                <w:rFonts w:eastAsia="Arial" w:cs="Segoe UI"/>
-                <w:i/>
-                <w:spacing w:val="-3"/>
-                <w:sz w:val="24"/>
-                <w:szCs w:val="22"/>
-              </w:rPr>
-              <w:t>Melleklet_db</w:t>
-            </w:r>
-            <w:proofErr w:type="spellEnd"/>
+              <w:t>{{Melleklet_db</w:t>
+            </w:r>
             <w:r>
               <w:rPr>
                 <w:rFonts w:eastAsia="Arial" w:cs="Segoe UI"/>
@@ -7987,8 +7922,6 @@
                 <w:szCs w:val="22"/>
               </w:rPr>
             </w:pPr>
-            <w:proofErr w:type="spellStart"/>
-            <w:proofErr w:type="gramStart"/>
             <w:r>
               <w:rPr>
                 <w:rFonts w:eastAsia="Arial" w:cs="Segoe UI"/>
@@ -7997,29 +7930,7 @@
                 <w:sz w:val="24"/>
                 <w:szCs w:val="22"/>
               </w:rPr>
-              <w:t>Azonosítói</w:t>
-            </w:r>
-            <w:proofErr w:type="spellEnd"/>
-            <w:r>
-              <w:rPr>
-                <w:rFonts w:eastAsia="Arial" w:cs="Segoe UI"/>
-                <w:i/>
-                <w:spacing w:val="-3"/>
-                <w:sz w:val="24"/>
-                <w:szCs w:val="22"/>
-              </w:rPr>
-              <w:t>(</w:t>
-            </w:r>
-            <w:proofErr w:type="gramEnd"/>
-            <w:r>
-              <w:rPr>
-                <w:rFonts w:eastAsia="Arial" w:cs="Segoe UI"/>
-                <w:i/>
-                <w:spacing w:val="-3"/>
-                <w:sz w:val="24"/>
-                <w:szCs w:val="22"/>
-              </w:rPr>
-              <w:t>k):</w:t>
+              <w:t>Azonosítói(k):</w:t>
             </w:r>
           </w:p>
         </w:tc>
@@ -8648,21 +8559,7 @@
               <w:rPr>
                 <w:rFonts w:eastAsia="Verdana"/>
               </w:rPr>
-              <w:t>-</w:t>
-            </w:r>
-            <w:proofErr w:type="spellStart"/>
-            <w:r>
-              <w:rPr>
-                <w:rFonts w:eastAsia="Verdana"/>
-              </w:rPr>
-              <w:t>ot</w:t>
-            </w:r>
-            <w:proofErr w:type="spellEnd"/>
-            <w:r>
-              <w:rPr>
-                <w:rFonts w:eastAsia="Verdana"/>
-              </w:rPr>
-              <w:t xml:space="preserve"> meghaladó csatlakozási teljesítményű villamos berendezésén,</w:t>
+              <w:t>-ot meghaladó csatlakozási teljesítményű villamos berendezésén,</w:t>
             </w:r>
           </w:p>
         </w:tc>
@@ -8746,21 +8643,7 @@
               <w:rPr>
                 <w:rFonts w:eastAsia="Verdana"/>
               </w:rPr>
-              <w:t>-</w:t>
-            </w:r>
-            <w:proofErr w:type="spellStart"/>
-            <w:r>
-              <w:rPr>
-                <w:rFonts w:eastAsia="Verdana"/>
-              </w:rPr>
-              <w:t>nél</w:t>
-            </w:r>
-            <w:proofErr w:type="spellEnd"/>
-            <w:r>
-              <w:rPr>
-                <w:rFonts w:eastAsia="Verdana"/>
-              </w:rPr>
-              <w:t xml:space="preserve"> nagyobb névleges áramerősségű túláram</w:t>
+              <w:t>-nél nagyobb névleges áramerősségű túláram</w:t>
             </w:r>
             <w:r>
               <w:rPr>
@@ -8855,21 +8738,7 @@
               <w:rPr>
                 <w:rFonts w:eastAsia="Verdana"/>
               </w:rPr>
-              <w:t xml:space="preserve"> szerint lakóépület, </w:t>
-            </w:r>
-            <w:proofErr w:type="gramStart"/>
-            <w:r>
-              <w:rPr>
-                <w:rFonts w:eastAsia="Verdana"/>
-              </w:rPr>
-              <w:t>kommunális</w:t>
-            </w:r>
-            <w:proofErr w:type="gramEnd"/>
-            <w:r>
-              <w:rPr>
-                <w:rFonts w:eastAsia="Verdana"/>
-              </w:rPr>
-              <w:t xml:space="preserve"> épület, valamint egyéb épület villamos berendezésén, ha az munkahelynek minősül,</w:t>
+              <w:t xml:space="preserve"> szerint lakóépület, kommunális épület, valamint egyéb épület villamos berendezésén, ha az munkahelynek minősül,</w:t>
             </w:r>
           </w:p>
         </w:tc>
@@ -8935,21 +8804,12 @@
                 <w:rFonts w:eastAsia="Verdana"/>
               </w:rPr>
             </w:pPr>
-            <w:proofErr w:type="gramStart"/>
             <w:r>
               <w:rPr>
                 <w:rFonts w:eastAsia="Verdana"/>
                 <w:b/>
               </w:rPr>
-              <w:t>&gt;</w:t>
-            </w:r>
-            <w:proofErr w:type="gramEnd"/>
-            <w:r>
-              <w:rPr>
-                <w:rFonts w:eastAsia="Verdana"/>
-                <w:b/>
-              </w:rPr>
-              <w:t>300 kg/l</w:t>
+              <w:t>&gt;300 kg/l</w:t>
             </w:r>
             <w:r>
               <w:rPr>
@@ -9230,16 +9090,8 @@
               <w:rPr>
                 <w:rFonts w:eastAsia="Verdana"/>
               </w:rPr>
-              <w:t xml:space="preserve">egyéb, itt nem </w:t>
-            </w:r>
-            <w:proofErr w:type="gramStart"/>
-            <w:r>
-              <w:rPr>
-                <w:rFonts w:eastAsia="Verdana"/>
-              </w:rPr>
-              <w:t>szereplő esetekben</w:t>
-            </w:r>
-            <w:proofErr w:type="gramEnd"/>
+              <w:t>egyéb, itt nem szereplő esetekben</w:t>
+            </w:r>
             <w:r>
               <w:rPr>
                 <w:rFonts w:eastAsia="Verdana"/>
@@ -9359,23 +9211,7 @@
                 <w:rFonts w:eastAsia="Arial"/>
                 <w:b/>
               </w:rPr>
-              <w:t xml:space="preserve">a kiadási </w:t>
-            </w:r>
-            <w:proofErr w:type="gramStart"/>
-            <w:r>
-              <w:rPr>
-                <w:rFonts w:eastAsia="Arial"/>
-                <w:b/>
-              </w:rPr>
-              <w:t>dátumtól</w:t>
-            </w:r>
-            <w:proofErr w:type="gramEnd"/>
-            <w:r>
-              <w:rPr>
-                <w:rFonts w:eastAsia="Arial"/>
-                <w:b/>
-              </w:rPr>
-              <w:t xml:space="preserve"> számított 3</w:t>
+              <w:t>a kiadási dátumtól számított 3</w:t>
             </w:r>
             <w:r>
               <w:rPr>
@@ -9412,23 +9248,7 @@
                 <w:rFonts w:eastAsia="Arial"/>
                 <w:b/>
               </w:rPr>
-              <w:t>-</w:t>
-            </w:r>
-            <w:proofErr w:type="spellStart"/>
-            <w:r>
-              <w:rPr>
-                <w:rFonts w:eastAsia="Arial"/>
-                <w:b/>
-              </w:rPr>
-              <w:t>ig</w:t>
-            </w:r>
-            <w:proofErr w:type="spellEnd"/>
-            <w:r>
-              <w:rPr>
-                <w:rFonts w:eastAsia="Arial"/>
-                <w:b/>
-              </w:rPr>
-              <w:t xml:space="preserve"> kell elvégezni.</w:t>
+              <w:t>-ig kell elvégezni.</w:t>
             </w:r>
           </w:p>
         </w:tc>
@@ -9452,6 +9272,12 @@
                 <w:rFonts w:eastAsia="Verdana"/>
               </w:rPr>
             </w:pPr>
+            <w:r>
+              <w:rPr>
+                <w:rFonts w:eastAsia="Verdana"/>
+              </w:rPr>
+              <w:t>{{3071}}</w:t>
+            </w:r>
           </w:p>
         </w:tc>
         <w:tc>
@@ -9478,23 +9304,7 @@
                 <w:rFonts w:eastAsia="Verdana"/>
                 <w:b/>
               </w:rPr>
-              <w:t xml:space="preserve">a kiadási </w:t>
-            </w:r>
-            <w:proofErr w:type="gramStart"/>
-            <w:r>
-              <w:rPr>
-                <w:rFonts w:eastAsia="Verdana"/>
-                <w:b/>
-              </w:rPr>
-              <w:t>dátumtól</w:t>
-            </w:r>
-            <w:proofErr w:type="gramEnd"/>
-            <w:r>
-              <w:rPr>
-                <w:rFonts w:eastAsia="Verdana"/>
-                <w:b/>
-              </w:rPr>
-              <w:t xml:space="preserve"> számított 6 éven belül, legkésőbb </w:t>
+              <w:t xml:space="preserve">a kiadási dátumtól számított 6 éven belül, legkésőbb </w:t>
             </w:r>
             <w:r>
               <w:rPr>
@@ -9519,21 +9329,12 @@
               </w:rPr>
               <w:t>}}-</w:t>
             </w:r>
-            <w:proofErr w:type="spellStart"/>
             <w:r>
               <w:rPr>
                 <w:rFonts w:eastAsia="Verdana"/>
                 <w:b/>
               </w:rPr>
-              <w:t>ig</w:t>
-            </w:r>
-            <w:proofErr w:type="spellEnd"/>
-            <w:r>
-              <w:rPr>
-                <w:rFonts w:eastAsia="Verdana"/>
-                <w:b/>
-              </w:rPr>
-              <w:t xml:space="preserve"> kell elvégezni.</w:t>
+              <w:t>ig kell elvégezni.</w:t>
             </w:r>
           </w:p>
         </w:tc>
@@ -9605,7 +9406,6 @@
               </w:rPr>
               <w:t xml:space="preserve">a lakóépületek villamos berendezésén (kivéve: lakások, ha </w:t>
             </w:r>
-            <w:proofErr w:type="spellStart"/>
             <w:r>
               <w:rPr>
                 <w:rFonts w:eastAsia="Arial"/>
@@ -9621,46 +9421,34 @@
               </w:rPr>
               <w:t>b</w:t>
             </w:r>
-            <w:proofErr w:type="spellEnd"/>
             <w:r>
               <w:rPr>
                 <w:rFonts w:eastAsia="Arial"/>
                 <w:b/>
               </w:rPr>
-              <w:t xml:space="preserve"> ≤ 32 </w:t>
-            </w:r>
-            <w:proofErr w:type="gramStart"/>
+              <w:t xml:space="preserve"> ≤ 32 A</w:t>
+            </w:r>
             <w:r>
               <w:rPr>
                 <w:rFonts w:eastAsia="Arial"/>
-                <w:b/>
-              </w:rPr>
-              <w:t>A</w:t>
-            </w:r>
-            <w:proofErr w:type="gramEnd"/>
+              </w:rPr>
+              <w:t xml:space="preserve"> és </w:t>
+            </w:r>
             <w:r>
               <w:rPr>
                 <w:rFonts w:eastAsia="Arial"/>
-              </w:rPr>
-              <w:t xml:space="preserve"> és </w:t>
-            </w:r>
-            <w:proofErr w:type="spellStart"/>
+                <w:b/>
+              </w:rPr>
+              <w:t>I</w:t>
+            </w:r>
             <w:r>
               <w:rPr>
                 <w:rFonts w:eastAsia="Arial"/>
                 <w:b/>
-              </w:rPr>
-              <w:t>I</w:t>
-            </w:r>
-            <w:r>
-              <w:rPr>
-                <w:rFonts w:eastAsia="Arial"/>
-                <w:b/>
                 <w:vertAlign w:val="subscript"/>
               </w:rPr>
               <w:t>Δn</w:t>
             </w:r>
-            <w:proofErr w:type="spellEnd"/>
             <w:r>
               <w:rPr>
                 <w:rFonts w:eastAsia="Arial"/>
@@ -9768,16 +9556,8 @@
               <w:rPr>
                 <w:rFonts w:eastAsia="Verdana"/>
               </w:rPr>
-              <w:t xml:space="preserve">egyéb, itt nem </w:t>
-            </w:r>
-            <w:proofErr w:type="gramStart"/>
-            <w:r>
-              <w:rPr>
-                <w:rFonts w:eastAsia="Verdana"/>
-              </w:rPr>
-              <w:t>szereplő esetekben</w:t>
-            </w:r>
-            <w:proofErr w:type="gramEnd"/>
+              <w:t>egyéb, itt nem szereplő esetekben</w:t>
+            </w:r>
           </w:p>
         </w:tc>
       </w:tr>
@@ -11606,21 +11386,7 @@
                 <w:rFonts w:eastAsia="Verdana" w:cs="Verdana"/>
                 <w:szCs w:val="22"/>
               </w:rPr>
-              <w:t>{{40</w:t>
-            </w:r>
-            <w:r>
-              <w:rPr>
-                <w:rFonts w:eastAsia="Verdana" w:cs="Verdana"/>
-                <w:szCs w:val="22"/>
-              </w:rPr>
-              <w:t>7</w:t>
-            </w:r>
-            <w:r>
-              <w:rPr>
-                <w:rFonts w:eastAsia="Verdana" w:cs="Verdana"/>
-                <w:szCs w:val="22"/>
-              </w:rPr>
-              <w:t>}}</w:t>
+              <w:t>{{407}}</w:t>
             </w:r>
           </w:p>
         </w:tc>
@@ -11680,21 +11446,7 @@
                 <w:rFonts w:eastAsia="Verdana" w:cs="Verdana"/>
                 <w:szCs w:val="22"/>
               </w:rPr>
-              <w:t>{{40</w:t>
-            </w:r>
-            <w:r>
-              <w:rPr>
-                <w:rFonts w:eastAsia="Verdana" w:cs="Verdana"/>
-                <w:szCs w:val="22"/>
-              </w:rPr>
-              <w:t>8</w:t>
-            </w:r>
-            <w:r>
-              <w:rPr>
-                <w:rFonts w:eastAsia="Verdana" w:cs="Verdana"/>
-                <w:szCs w:val="22"/>
-              </w:rPr>
-              <w:t>}}</w:t>
+              <w:t>{{408}}</w:t>
             </w:r>
           </w:p>
         </w:tc>
@@ -11754,21 +11506,16 @@
                 <w:rFonts w:eastAsia="Verdana" w:cs="Verdana"/>
                 <w:szCs w:val="22"/>
               </w:rPr>
-              <w:t>{{40</w:t>
-            </w:r>
+              <w:t>{{409}</w:t>
+            </w:r>
+            <w:bookmarkStart w:id="0" w:name="_GoBack"/>
+            <w:bookmarkEnd w:id="0"/>
             <w:r>
               <w:rPr>
                 <w:rFonts w:eastAsia="Verdana" w:cs="Verdana"/>
                 <w:szCs w:val="22"/>
               </w:rPr>
-              <w:t>9</w:t>
-            </w:r>
-            <w:r>
-              <w:rPr>
-                <w:rFonts w:eastAsia="Verdana" w:cs="Verdana"/>
-                <w:szCs w:val="22"/>
-              </w:rPr>
-              <w:t>}}</w:t>
+              <w:t>}</w:t>
             </w:r>
           </w:p>
         </w:tc>
@@ -11793,21 +11540,7 @@
               <w:rPr>
                 <w:rFonts w:eastAsia="Verdana"/>
               </w:rPr>
-              <w:t xml:space="preserve">Védelem </w:t>
-            </w:r>
-            <w:proofErr w:type="spellStart"/>
-            <w:r>
-              <w:rPr>
-                <w:rFonts w:eastAsia="Verdana"/>
-              </w:rPr>
-              <w:t>földeletlen</w:t>
-            </w:r>
-            <w:proofErr w:type="spellEnd"/>
-            <w:r>
-              <w:rPr>
-                <w:rFonts w:eastAsia="Verdana"/>
-              </w:rPr>
-              <w:t xml:space="preserve"> helyi egyenpotenciálú összekötéssel</w:t>
+              <w:t>Védelem földeletlen helyi egyenpotenciálú összekötéssel</w:t>
             </w:r>
           </w:p>
         </w:tc>
@@ -12931,42 +12664,8 @@
                 <w:rFonts w:eastAsia="Verdana"/>
                 <w:sz w:val="20"/>
               </w:rPr>
-              <w:t>{{</w:t>
-            </w:r>
-            <w:proofErr w:type="spellStart"/>
-            <w:r>
-              <w:rPr>
-                <w:rFonts w:eastAsia="Verdana"/>
-                <w:sz w:val="20"/>
-              </w:rPr>
-              <w:t>jogyszabályok</w:t>
-            </w:r>
-            <w:proofErr w:type="gramStart"/>
-            <w:r>
-              <w:rPr>
-                <w:rFonts w:eastAsia="Verdana"/>
-                <w:sz w:val="20"/>
-              </w:rPr>
-              <w:t>.jogyszabaly</w:t>
-            </w:r>
-            <w:proofErr w:type="gramEnd"/>
-            <w:r>
-              <w:rPr>
-                <w:rFonts w:eastAsia="Verdana"/>
-                <w:sz w:val="20"/>
-              </w:rPr>
-              <w:t>_szam</w:t>
-            </w:r>
-            <w:proofErr w:type="spellEnd"/>
-            <w:r>
-              <w:rPr>
-                <w:rFonts w:eastAsia="Verdana"/>
-                <w:sz w:val="20"/>
-              </w:rPr>
-              <w:t>}}</w:t>
-            </w:r>
-            <w:bookmarkStart w:id="0" w:name="_GoBack"/>
-            <w:bookmarkEnd w:id="0"/>
+              <w:t>{{jogyszabályok.jogyszabaly_szam}}</w:t>
+            </w:r>
           </w:p>
         </w:tc>
         <w:tc>
@@ -13158,141 +12857,39 @@
                 <w:sz w:val="20"/>
               </w:rPr>
             </w:pPr>
-            <w:proofErr w:type="spellStart"/>
             <w:r>
               <w:rPr>
                 <w:rFonts w:eastAsia="Verdana"/>
                 <w:i/>
                 <w:sz w:val="20"/>
               </w:rPr>
-              <w:t>TvMI</w:t>
-            </w:r>
-            <w:proofErr w:type="spellEnd"/>
+              <w:t>TvMI 7.5:2022.06.13.</w:t>
+            </w:r>
             <w:r>
               <w:rPr>
                 <w:rFonts w:eastAsia="Verdana"/>
                 <w:i/>
                 <w:sz w:val="20"/>
               </w:rPr>
-              <w:t xml:space="preserve"> 7.5:2022.06.13.</w:t>
-            </w:r>
-            <w:r>
+              <w:t xml:space="preserve"> (vill. ber., villámvédelem, elektrosztatika)</w:t>
+            </w:r>
+          </w:p>
+          <w:p>
+            <w:pPr>
+              <w:ind w:right="-17"/>
               <w:rPr>
                 <w:rFonts w:eastAsia="Verdana"/>
                 <w:i/>
                 <w:sz w:val="20"/>
               </w:rPr>
-              <w:t xml:space="preserve"> (</w:t>
-            </w:r>
-            <w:proofErr w:type="spellStart"/>
+            </w:pPr>
             <w:r>
               <w:rPr>
                 <w:rFonts w:eastAsia="Verdana"/>
                 <w:i/>
                 <w:sz w:val="20"/>
               </w:rPr>
-              <w:t>vill</w:t>
-            </w:r>
-            <w:proofErr w:type="spellEnd"/>
-            <w:r>
-              <w:rPr>
-                <w:rFonts w:eastAsia="Verdana"/>
-                <w:i/>
-                <w:sz w:val="20"/>
-              </w:rPr>
-              <w:t xml:space="preserve">. </w:t>
-            </w:r>
-            <w:proofErr w:type="spellStart"/>
-            <w:r>
-              <w:rPr>
-                <w:rFonts w:eastAsia="Verdana"/>
-                <w:i/>
-                <w:sz w:val="20"/>
-              </w:rPr>
-              <w:t>ber</w:t>
-            </w:r>
-            <w:proofErr w:type="spellEnd"/>
-            <w:proofErr w:type="gramStart"/>
-            <w:r>
-              <w:rPr>
-                <w:rFonts w:eastAsia="Verdana"/>
-                <w:i/>
-                <w:sz w:val="20"/>
-              </w:rPr>
-              <w:t>.,</w:t>
-            </w:r>
-            <w:proofErr w:type="gramEnd"/>
-            <w:r>
-              <w:rPr>
-                <w:rFonts w:eastAsia="Verdana"/>
-                <w:i/>
-                <w:sz w:val="20"/>
-              </w:rPr>
-              <w:t xml:space="preserve"> villámvédelem, elektrosztatika)</w:t>
-            </w:r>
-          </w:p>
-          <w:p>
-            <w:pPr>
-              <w:ind w:right="-17"/>
-              <w:rPr>
-                <w:rFonts w:eastAsia="Verdana"/>
-                <w:i/>
-                <w:sz w:val="20"/>
-              </w:rPr>
-            </w:pPr>
-            <w:proofErr w:type="spellStart"/>
-            <w:r>
-              <w:rPr>
-                <w:rFonts w:eastAsia="Verdana"/>
-                <w:i/>
-                <w:sz w:val="20"/>
-              </w:rPr>
-              <w:t>TvMI</w:t>
-            </w:r>
-            <w:proofErr w:type="spellEnd"/>
-            <w:r>
-              <w:rPr>
-                <w:rFonts w:eastAsia="Verdana"/>
-                <w:i/>
-                <w:sz w:val="20"/>
-              </w:rPr>
-              <w:t xml:space="preserve"> 7.6:2024.02.01. (</w:t>
-            </w:r>
-            <w:proofErr w:type="spellStart"/>
-            <w:r>
-              <w:rPr>
-                <w:rFonts w:eastAsia="Verdana"/>
-                <w:i/>
-                <w:sz w:val="20"/>
-              </w:rPr>
-              <w:t>vill</w:t>
-            </w:r>
-            <w:proofErr w:type="spellEnd"/>
-            <w:r>
-              <w:rPr>
-                <w:rFonts w:eastAsia="Verdana"/>
-                <w:i/>
-                <w:sz w:val="20"/>
-              </w:rPr>
-              <w:t xml:space="preserve">. </w:t>
-            </w:r>
-            <w:proofErr w:type="spellStart"/>
-            <w:r>
-              <w:rPr>
-                <w:rFonts w:eastAsia="Verdana"/>
-                <w:i/>
-                <w:sz w:val="20"/>
-              </w:rPr>
-              <w:t>ber</w:t>
-            </w:r>
-            <w:proofErr w:type="spellEnd"/>
-            <w:r>
-              <w:rPr>
-                <w:rFonts w:eastAsia="Verdana"/>
-                <w:i/>
-                <w:sz w:val="20"/>
-              </w:rPr>
-              <w:t>, villámvédelem, elektrosztatika)</w:t>
+              <w:t>TvMI 7.6:2024.02.01. (vill. ber, villámvédelem, elektrosztatika)</w:t>
             </w:r>
           </w:p>
         </w:tc>
@@ -13423,23 +13020,13 @@
                 <w:sz w:val="20"/>
               </w:rPr>
             </w:pPr>
-            <w:proofErr w:type="spellStart"/>
             <w:r>
               <w:rPr>
                 <w:rFonts w:eastAsia="Verdana"/>
                 <w:i/>
                 <w:sz w:val="20"/>
               </w:rPr>
-              <w:t>TvMI</w:t>
-            </w:r>
-            <w:proofErr w:type="spellEnd"/>
-            <w:r>
-              <w:rPr>
-                <w:rFonts w:eastAsia="Verdana"/>
-                <w:i/>
-                <w:sz w:val="20"/>
-              </w:rPr>
-              <w:t xml:space="preserve"> 12.5:2022.06.13.</w:t>
+              <w:t>TvMI 12.5:2022.06.13.</w:t>
             </w:r>
             <w:r>
               <w:rPr>
@@ -13562,23 +13149,13 @@
                 <w:sz w:val="20"/>
               </w:rPr>
             </w:pPr>
-            <w:proofErr w:type="spellStart"/>
             <w:r>
               <w:rPr>
                 <w:rFonts w:eastAsia="Verdana"/>
                 <w:i/>
                 <w:sz w:val="20"/>
               </w:rPr>
-              <w:t>TvMI</w:t>
-            </w:r>
-            <w:proofErr w:type="spellEnd"/>
-            <w:r>
-              <w:rPr>
-                <w:rFonts w:eastAsia="Verdana"/>
-                <w:i/>
-                <w:sz w:val="20"/>
-              </w:rPr>
-              <w:t xml:space="preserve"> 14.2:2022.06.13.</w:t>
+              <w:t>TvMI 14.2:2022.06.13.</w:t>
             </w:r>
             <w:r>
               <w:rPr>
@@ -15948,19 +15525,8 @@
                 <w:szCs w:val="16"/>
                 <w:lang w:val="hu-HU"/>
               </w:rPr>
-              <w:t xml:space="preserve">tanúsítványok és gyártói </w:t>
-            </w:r>
-            <w:proofErr w:type="gramStart"/>
-            <w:r>
-              <w:rPr>
-                <w:rFonts w:ascii="Aptos" w:hAnsi="Aptos"/>
-                <w:sz w:val="16"/>
-                <w:szCs w:val="16"/>
-                <w:lang w:val="hu-HU"/>
-              </w:rPr>
-              <w:t>információk</w:t>
-            </w:r>
-            <w:proofErr w:type="gramEnd"/>
+              <w:t>tanúsítványok és gyártói információk</w:t>
+            </w:r>
             <w:r>
               <w:rPr>
                 <w:rFonts w:ascii="Aptos" w:hAnsi="Aptos"/>
@@ -18885,27 +18451,7 @@
                 <w:szCs w:val="16"/>
                 <w:lang w:val="hu-HU"/>
               </w:rPr>
-              <w:t xml:space="preserve">p) vezetékek, </w:t>
-            </w:r>
-            <w:proofErr w:type="spellStart"/>
-            <w:r>
-              <w:rPr>
-                <w:rFonts w:ascii="Aptos" w:hAnsi="Aptos"/>
-                <w:sz w:val="16"/>
-                <w:szCs w:val="16"/>
-                <w:lang w:val="hu-HU"/>
-              </w:rPr>
-              <w:t>huzalozás</w:t>
-            </w:r>
-            <w:proofErr w:type="spellEnd"/>
-            <w:r>
-              <w:rPr>
-                <w:rFonts w:ascii="Aptos" w:hAnsi="Aptos"/>
-                <w:sz w:val="16"/>
-                <w:szCs w:val="16"/>
-                <w:lang w:val="hu-HU"/>
-              </w:rPr>
-              <w:t xml:space="preserve"> (MSZ HD 60364-5-52 sz.521.,522. f. alapján)</w:t>
+              <w:t>p) vezetékek, huzalozás (MSZ HD 60364-5-52 sz.521.,522. f. alapján)</w:t>
             </w:r>
           </w:p>
         </w:tc>
@@ -20490,23 +20036,7 @@
                 <w:rFonts w:ascii="Aptos" w:hAnsi="Aptos"/>
                 <w:lang w:val="hu-HU"/>
               </w:rPr>
-              <w:t xml:space="preserve"> üzemszerű </w:t>
-            </w:r>
-            <w:proofErr w:type="gramStart"/>
-            <w:r>
-              <w:rPr>
-                <w:rFonts w:ascii="Aptos" w:hAnsi="Aptos"/>
-                <w:lang w:val="hu-HU"/>
-              </w:rPr>
-              <w:t>funkciók</w:t>
-            </w:r>
-            <w:proofErr w:type="gramEnd"/>
-            <w:r>
-              <w:rPr>
-                <w:rFonts w:ascii="Aptos" w:hAnsi="Aptos"/>
-                <w:lang w:val="hu-HU"/>
-              </w:rPr>
-              <w:t xml:space="preserve"> és működés ellenőrzése (6.4.3.10. szakasz)</w:t>
+              <w:t xml:space="preserve"> üzemszerű funkciók és működés ellenőrzése (6.4.3.10. szakasz)</w:t>
             </w:r>
           </w:p>
         </w:tc>
@@ -21932,27 +21462,7 @@
                 <w:szCs w:val="20"/>
                 <w:lang w:val="hu-HU"/>
               </w:rPr>
-              <w:t>1</w:t>
-            </w:r>
-            <w:proofErr w:type="gramStart"/>
-            <w:r>
-              <w:rPr>
-                <w:rFonts w:ascii="Aptos" w:hAnsi="Aptos"/>
-                <w:sz w:val="18"/>
-                <w:szCs w:val="20"/>
-                <w:lang w:val="hu-HU"/>
-              </w:rPr>
-              <w:t>)c</w:t>
-            </w:r>
-            <w:proofErr w:type="gramEnd"/>
-            <w:r>
-              <w:rPr>
-                <w:rFonts w:ascii="Aptos" w:hAnsi="Aptos"/>
-                <w:sz w:val="18"/>
-                <w:szCs w:val="20"/>
-                <w:lang w:val="hu-HU"/>
-              </w:rPr>
-              <w:t xml:space="preserve">, </w:t>
+              <w:t xml:space="preserve">1)c, </w:t>
             </w:r>
             <w:r>
               <w:rPr>
@@ -22434,27 +21944,7 @@
                 <w:szCs w:val="20"/>
                 <w:lang w:val="hu-HU"/>
               </w:rPr>
-              <w:t xml:space="preserve">Alagutak és felszín alatti vasutak </w:t>
-            </w:r>
-            <w:proofErr w:type="gramStart"/>
-            <w:r>
-              <w:rPr>
-                <w:rFonts w:ascii="Aptos" w:hAnsi="Aptos"/>
-                <w:sz w:val="18"/>
-                <w:szCs w:val="20"/>
-                <w:lang w:val="hu-HU"/>
-              </w:rPr>
-              <w:t>speciális</w:t>
-            </w:r>
-            <w:proofErr w:type="gramEnd"/>
-            <w:r>
-              <w:rPr>
-                <w:rFonts w:ascii="Aptos" w:hAnsi="Aptos"/>
-                <w:sz w:val="18"/>
-                <w:szCs w:val="20"/>
-                <w:lang w:val="hu-HU"/>
-              </w:rPr>
-              <w:t xml:space="preserve"> előírásait teljesítették-e? </w:t>
+              <w:t xml:space="preserve">Alagutak és felszín alatti vasutak speciális előírásait teljesítették-e? </w:t>
             </w:r>
             <w:r>
               <w:rPr>
@@ -22662,27 +22152,7 @@
                 <w:szCs w:val="20"/>
                 <w:lang w:val="hu-HU"/>
               </w:rPr>
-              <w:t xml:space="preserve">Központi, ill. </w:t>
-            </w:r>
-            <w:proofErr w:type="spellStart"/>
-            <w:r>
-              <w:rPr>
-                <w:rFonts w:ascii="Aptos" w:hAnsi="Aptos"/>
-                <w:sz w:val="18"/>
-                <w:szCs w:val="20"/>
-                <w:lang w:val="hu-HU"/>
-              </w:rPr>
-              <w:t>részegységenkénti</w:t>
-            </w:r>
-            <w:proofErr w:type="spellEnd"/>
-            <w:r>
-              <w:rPr>
-                <w:rFonts w:ascii="Aptos" w:hAnsi="Aptos"/>
-                <w:sz w:val="18"/>
-                <w:szCs w:val="20"/>
-                <w:lang w:val="hu-HU"/>
-              </w:rPr>
-              <w:t xml:space="preserve"> tűzeseti lekapcsolás </w:t>
+              <w:t xml:space="preserve">Központi, ill. részegységenkénti tűzeseti lekapcsolás </w:t>
             </w:r>
             <w:r>
               <w:rPr>
@@ -22860,27 +22330,7 @@
                 <w:szCs w:val="20"/>
                 <w:lang w:val="hu-HU"/>
               </w:rPr>
-              <w:t>o. épületek követelményei (lekapcsolás, száraz</w:t>
-            </w:r>
-            <w:proofErr w:type="gramStart"/>
-            <w:r>
-              <w:rPr>
-                <w:rFonts w:ascii="Aptos" w:hAnsi="Aptos"/>
-                <w:sz w:val="18"/>
-                <w:szCs w:val="20"/>
-                <w:lang w:val="hu-HU"/>
-              </w:rPr>
-              <w:t>transzformátor</w:t>
-            </w:r>
-            <w:proofErr w:type="gramEnd"/>
-            <w:r>
-              <w:rPr>
-                <w:rFonts w:ascii="Aptos" w:hAnsi="Aptos"/>
-                <w:sz w:val="18"/>
-                <w:szCs w:val="20"/>
-                <w:lang w:val="hu-HU"/>
-              </w:rPr>
-              <w:t xml:space="preserve">) </w:t>
+              <w:t xml:space="preserve">o. épületek követelményei (lekapcsolás, száraztranszformátor) </w:t>
             </w:r>
             <w:r>
               <w:rPr>
@@ -23858,7 +23308,6 @@
               </w:rPr>
               <w:t xml:space="preserve"> </w:t>
             </w:r>
-            <w:proofErr w:type="gramStart"/>
             <w:r>
               <w:rPr>
                 <w:rFonts w:ascii="Aptos" w:hAnsi="Aptos"/>
@@ -23866,17 +23315,7 @@
                 <w:szCs w:val="20"/>
                 <w:lang w:val="hu-HU"/>
               </w:rPr>
-              <w:t>A</w:t>
-            </w:r>
-            <w:proofErr w:type="gramEnd"/>
-            <w:r>
-              <w:rPr>
-                <w:rFonts w:ascii="Aptos" w:hAnsi="Aptos"/>
-                <w:sz w:val="18"/>
-                <w:szCs w:val="20"/>
-                <w:lang w:val="hu-HU"/>
-              </w:rPr>
-              <w:t xml:space="preserve"> villamos berendezés nem </w:t>
+              <w:t xml:space="preserve">A villamos berendezés nem </w:t>
             </w:r>
             <w:r>
               <w:rPr>
@@ -24384,7 +23823,6 @@
               </w:rPr>
               <w:t xml:space="preserve"> </w:t>
             </w:r>
-            <w:proofErr w:type="gramStart"/>
             <w:r>
               <w:rPr>
                 <w:rFonts w:ascii="Aptos" w:hAnsi="Aptos"/>
@@ -24394,19 +23832,7 @@
                 <w:szCs w:val="20"/>
                 <w:lang w:val="hu-HU"/>
               </w:rPr>
-              <w:t>A</w:t>
-            </w:r>
-            <w:proofErr w:type="gramEnd"/>
-            <w:r>
-              <w:rPr>
-                <w:rFonts w:ascii="Aptos" w:hAnsi="Aptos"/>
-                <w:i/>
-                <w:iCs/>
-                <w:sz w:val="20"/>
-                <w:szCs w:val="20"/>
-                <w:lang w:val="hu-HU"/>
-              </w:rPr>
-              <w:t xml:space="preserve"> beépített tűzjelző és tűzoltó berendezések részletes ellenőrzése nem feladata a felülvizsgálónak, csak ezek erősáramú betáplálása, a kábelrendszerek tűzállósági követelményeinek teljesülésének ellenőrzése!</w:t>
+              <w:t>A beépített tűzjelző és tűzoltó berendezések részletes ellenőrzése nem feladata a felülvizsgálónak, csak ezek erősáramú betáplálása, a kábelrendszerek tűzállósági követelményeinek teljesülésének ellenőrzése!</w:t>
             </w:r>
           </w:p>
         </w:tc>
@@ -24446,29 +23872,7 @@
                 <w:szCs w:val="20"/>
                 <w:lang w:val="hu-HU"/>
               </w:rPr>
-              <w:t xml:space="preserve">Megjegyzések a </w:t>
-            </w:r>
-            <w:proofErr w:type="spellStart"/>
-            <w:r>
-              <w:rPr>
-                <w:rFonts w:ascii="Aptos" w:hAnsi="Aptos"/>
-                <w:b/>
-                <w:sz w:val="20"/>
-                <w:szCs w:val="20"/>
-                <w:lang w:val="hu-HU"/>
-              </w:rPr>
-              <w:t>TvMI</w:t>
-            </w:r>
-            <w:proofErr w:type="spellEnd"/>
-            <w:r>
-              <w:rPr>
-                <w:rFonts w:ascii="Aptos" w:hAnsi="Aptos"/>
-                <w:b/>
-                <w:sz w:val="20"/>
-                <w:szCs w:val="20"/>
-                <w:lang w:val="hu-HU"/>
-              </w:rPr>
-              <w:t>-k alapján:</w:t>
+              <w:t>Megjegyzések a TvMI-k alapján:</w:t>
             </w:r>
           </w:p>
         </w:tc>
@@ -29490,23 +28894,7 @@
                 <w:rFonts w:eastAsia="Verdana"/>
                 <w:lang w:val="hu-HU"/>
               </w:rPr>
-              <w:t xml:space="preserve">ÚTMUTATÓ </w:t>
-            </w:r>
-            <w:proofErr w:type="gramStart"/>
-            <w:r>
-              <w:rPr>
-                <w:rFonts w:eastAsia="Verdana"/>
-                <w:lang w:val="hu-HU"/>
-              </w:rPr>
-              <w:t>A</w:t>
-            </w:r>
-            <w:proofErr w:type="gramEnd"/>
-            <w:r>
-              <w:rPr>
-                <w:rFonts w:eastAsia="Verdana"/>
-                <w:lang w:val="hu-HU"/>
-              </w:rPr>
-              <w:t xml:space="preserve"> MEGRENDELŐNEK</w:t>
+              <w:t>ÚTMUTATÓ A MEGRENDELŐNEK</w:t>
             </w:r>
           </w:p>
         </w:tc>
@@ -29539,23 +28927,7 @@
                 <w:b/>
                 <w:lang w:val="hu-HU"/>
               </w:rPr>
-              <w:t xml:space="preserve">E dokumentáció fontos és értékes </w:t>
-            </w:r>
-            <w:proofErr w:type="gramStart"/>
-            <w:r>
-              <w:rPr>
-                <w:b/>
-                <w:lang w:val="hu-HU"/>
-              </w:rPr>
-              <w:t>dokumentum</w:t>
-            </w:r>
-            <w:proofErr w:type="gramEnd"/>
-            <w:r>
-              <w:rPr>
-                <w:b/>
-                <w:lang w:val="hu-HU"/>
-              </w:rPr>
-              <w:t>, amelyet meg kell őrizni.</w:t>
+              <w:t>E dokumentáció fontos és értékes dokumentum, amelyet meg kell őrizni.</w:t>
             </w:r>
           </w:p>
         </w:tc>
@@ -29756,21 +29128,7 @@
               <w:rPr>
                 <w:lang w:val="hu-HU"/>
               </w:rPr>
-              <w:t xml:space="preserve">Az eredeti dokumentációt biztonságos helyen meg kell őrizni, és minden olyan személynek a rendelkezésére kell bocsátani, aki a jövőben a villamos berendezést </w:t>
-            </w:r>
-            <w:proofErr w:type="gramStart"/>
-            <w:r>
-              <w:rPr>
-                <w:lang w:val="hu-HU"/>
-              </w:rPr>
-              <w:t>felülvizsgálja</w:t>
-            </w:r>
-            <w:proofErr w:type="gramEnd"/>
-            <w:r>
-              <w:rPr>
-                <w:lang w:val="hu-HU"/>
-              </w:rPr>
-              <w:t xml:space="preserve"> vagy azon munkát végez. Ha az ingatlan megüresedik, akkor ezt a dokumentációt az új tulajdonossal/bérlővel meg kell ismertetni a villamos berendezésnek a dokumentáció készítésének idején érvényes állapotának részleteivel együtt.</w:t>
+              <w:t>Az eredeti dokumentációt biztonságos helyen meg kell őrizni, és minden olyan személynek a rendelkezésére kell bocsátani, aki a jövőben a villamos berendezést felülvizsgálja vagy azon munkát végez. Ha az ingatlan megüresedik, akkor ezt a dokumentációt az új tulajdonossal/bérlővel meg kell ismertetni a villamos berendezésnek a dokumentáció készítésének idején érvényes állapotának részleteivel együtt.</w:t>
             </w:r>
           </w:p>
         </w:tc>
@@ -29993,21 +29351,7 @@
               <w:rPr>
                 <w:lang w:val="hu-HU"/>
               </w:rPr>
-              <w:t xml:space="preserve">, és javasolt, hogy </w:t>
-            </w:r>
-            <w:proofErr w:type="gramStart"/>
-            <w:r>
-              <w:rPr>
-                <w:lang w:val="hu-HU"/>
-              </w:rPr>
-              <w:t>kompetens</w:t>
-            </w:r>
-            <w:proofErr w:type="gramEnd"/>
-            <w:r>
-              <w:rPr>
-                <w:lang w:val="hu-HU"/>
-              </w:rPr>
-              <w:t xml:space="preserve"> személy azonnal elvégezze a hibajavítást.</w:t>
+              <w:t>, és javasolt, hogy kompetens személy azonnal elvégezze a hibajavítást.</w:t>
             </w:r>
           </w:p>
         </w:tc>
@@ -30076,21 +29420,7 @@
               <w:rPr>
                 <w:lang w:val="hu-HU"/>
               </w:rPr>
-              <w:t xml:space="preserve">, és javasolt, hogy </w:t>
-            </w:r>
-            <w:proofErr w:type="gramStart"/>
-            <w:r>
-              <w:rPr>
-                <w:lang w:val="hu-HU"/>
-              </w:rPr>
-              <w:t>kompetens</w:t>
-            </w:r>
-            <w:proofErr w:type="gramEnd"/>
-            <w:r>
-              <w:rPr>
-                <w:lang w:val="hu-HU"/>
-              </w:rPr>
-              <w:t xml:space="preserve"> személy sürgősen végezze el a hibajavítást.</w:t>
+              <w:t>, és javasolt, hogy kompetens személy sürgősen végezze el a hibajavítást.</w:t>
             </w:r>
           </w:p>
         </w:tc>
@@ -30202,21 +29532,7 @@
               <w:rPr>
                 <w:lang w:val="hu-HU"/>
               </w:rPr>
-              <w:t xml:space="preserve">Biztonsági okokból a villamos berendezést megfelelő időközönként </w:t>
-            </w:r>
-            <w:proofErr w:type="gramStart"/>
-            <w:r>
-              <w:rPr>
-                <w:lang w:val="hu-HU"/>
-              </w:rPr>
-              <w:t>kompetens</w:t>
-            </w:r>
-            <w:proofErr w:type="gramEnd"/>
-            <w:r>
-              <w:rPr>
-                <w:lang w:val="hu-HU"/>
-              </w:rPr>
-              <w:t xml:space="preserve"> személynek ismételten felül kell vizsgálnia. A következő felülvizsgálat javasolt időpontja a dokumentációban fel van tüntetve.</w:t>
+              <w:t>Biztonsági okokból a villamos berendezést megfelelő időközönként kompetens személynek ismételten felül kell vizsgálnia. A következő felülvizsgálat javasolt időpontja a dokumentációban fel van tüntetve.</w:t>
             </w:r>
           </w:p>
         </w:tc>
@@ -30315,7 +29631,7 @@
         <w:noProof/>
         <w:szCs w:val="22"/>
       </w:rPr>
-      <w:t>11</w:t>
+      <w:t>2</w:t>
     </w:r>
     <w:r>
       <w:rPr>

</xml_diff>

<commit_message>
5-7. oldal hozzáadva: MSZ HD 60364-6, OTSZ, VMBSZ, védelmek, áramkörök
</commit_message>
<xml_diff>
--- a/BiztvillCRM.Web/wwwroot/sablonok/VBF_KIF_MINTA.docx
+++ b/BiztvillCRM.Web/wwwroot/sablonok/VBF_KIF_MINTA.docx
@@ -26583,17 +26583,7 @@
                 <w:i/>
                 <w:lang w:val="hu-HU"/>
               </w:rPr>
-              <w:t>Minden kisfeszültségű villamos, illetve RB-kivitelű szerkezetre igazolni kell a biztonsági követelm</w:t>
-            </w:r>
-            <w:bookmarkStart w:id="2" w:name="_GoBack"/>
-            <w:bookmarkEnd w:id="2"/>
-            <w:r>
-              <w:rPr>
-                <w:rFonts w:ascii="Aptos" w:hAnsi="Aptos"/>
-                <w:i/>
-                <w:lang w:val="hu-HU"/>
-              </w:rPr>
-              <w:t>ények teljesülését.</w:t>
+              <w:t>Minden kisfeszültségű villamos, illetve RB-kivitelű szerkezetre igazolni kell a biztonsági követelmények teljesülését.</w:t>
             </w:r>
           </w:p>
           <w:p>
@@ -26643,13 +26633,7 @@
               <w:rPr>
                 <w:rFonts w:cs="Segoe UI"/>
               </w:rPr>
-              <w:t>{{718</w:t>
-            </w:r>
-            <w:r>
-              <w:rPr>
-                <w:rFonts w:cs="Segoe UI"/>
-              </w:rPr>
-              <w:t>}}</w:t>
+              <w:t>{{718}}</w:t>
             </w:r>
           </w:p>
         </w:tc>
@@ -26678,14 +26662,7 @@
                 <w:rFonts w:ascii="Aptos" w:hAnsi="Aptos"/>
                 <w:lang w:val="hu-HU"/>
               </w:rPr>
-              <w:t>{{718</w:t>
-            </w:r>
-            <w:r>
-              <w:rPr>
-                <w:rFonts w:ascii="Aptos" w:hAnsi="Aptos"/>
-                <w:lang w:val="hu-HU"/>
-              </w:rPr>
-              <w:t>M}}</w:t>
+              <w:t>{{718M}}</w:t>
             </w:r>
           </w:p>
         </w:tc>
@@ -26753,13 +26730,7 @@
               <w:rPr>
                 <w:rFonts w:cs="Segoe UI"/>
               </w:rPr>
-              <w:t>{{719</w:t>
-            </w:r>
-            <w:r>
-              <w:rPr>
-                <w:rFonts w:cs="Segoe UI"/>
-              </w:rPr>
-              <w:t>}}</w:t>
+              <w:t>{{719}}</w:t>
             </w:r>
           </w:p>
         </w:tc>
@@ -26788,14 +26759,7 @@
                 <w:rFonts w:ascii="Aptos" w:hAnsi="Aptos"/>
                 <w:lang w:val="hu-HU"/>
               </w:rPr>
-              <w:t>{{719</w:t>
-            </w:r>
-            <w:r>
-              <w:rPr>
-                <w:rFonts w:ascii="Aptos" w:hAnsi="Aptos"/>
-                <w:lang w:val="hu-HU"/>
-              </w:rPr>
-              <w:t>M}}</w:t>
+              <w:t>{{719M}}</w:t>
             </w:r>
           </w:p>
         </w:tc>
@@ -26863,13 +26827,7 @@
               <w:rPr>
                 <w:rFonts w:cs="Segoe UI"/>
               </w:rPr>
-              <w:t>{{720</w:t>
-            </w:r>
-            <w:r>
-              <w:rPr>
-                <w:rFonts w:cs="Segoe UI"/>
-              </w:rPr>
-              <w:t>}}</w:t>
+              <w:t>{{720}}</w:t>
             </w:r>
           </w:p>
         </w:tc>
@@ -26898,14 +26856,7 @@
                 <w:rFonts w:ascii="Aptos" w:hAnsi="Aptos"/>
                 <w:lang w:val="hu-HU"/>
               </w:rPr>
-              <w:t>{{720</w:t>
-            </w:r>
-            <w:r>
-              <w:rPr>
-                <w:rFonts w:ascii="Aptos" w:hAnsi="Aptos"/>
-                <w:lang w:val="hu-HU"/>
-              </w:rPr>
-              <w:t>M}}</w:t>
+              <w:t>{{720M}}</w:t>
             </w:r>
           </w:p>
         </w:tc>
@@ -26973,13 +26924,7 @@
               <w:rPr>
                 <w:rFonts w:cs="Segoe UI"/>
               </w:rPr>
-              <w:t>{{721</w:t>
-            </w:r>
-            <w:r>
-              <w:rPr>
-                <w:rFonts w:cs="Segoe UI"/>
-              </w:rPr>
-              <w:t>}}</w:t>
+              <w:t>{{721}}</w:t>
             </w:r>
           </w:p>
         </w:tc>
@@ -27008,21 +26953,7 @@
                 <w:rFonts w:ascii="Aptos" w:hAnsi="Aptos"/>
                 <w:lang w:val="hu-HU"/>
               </w:rPr>
-              <w:t>{{7</w:t>
-            </w:r>
-            <w:r>
-              <w:rPr>
-                <w:rFonts w:ascii="Aptos" w:hAnsi="Aptos"/>
-                <w:lang w:val="hu-HU"/>
-              </w:rPr>
-              <w:t>2</w:t>
-            </w:r>
-            <w:r>
-              <w:rPr>
-                <w:rFonts w:ascii="Aptos" w:hAnsi="Aptos"/>
-                <w:lang w:val="hu-HU"/>
-              </w:rPr>
-              <w:t>1M}}</w:t>
+              <w:t>{{721M}}</w:t>
             </w:r>
           </w:p>
         </w:tc>
@@ -27292,7 +27223,7 @@
       </w:tr>
       <w:tr>
         <w:trPr>
-          <w:trHeight w:val="1077"/>
+          <w:trHeight w:val="855"/>
           <w:jc w:val="center"/>
         </w:trPr>
         <w:tc>
@@ -27324,7 +27255,7 @@
       </w:tr>
       <w:tr>
         <w:trPr>
-          <w:trHeight w:val="1247"/>
+          <w:trHeight w:val="1905"/>
           <w:jc w:val="center"/>
         </w:trPr>
         <w:tc>
@@ -27366,31 +27297,38 @@
           </w:tcPr>
           <w:p>
             <w:pPr>
-              <w:ind w:left="135"/>
-              <w:rPr>
-                <w:lang w:val="hu-HU"/>
-              </w:rPr>
-            </w:pPr>
-            <w:r>
-              <w:rPr>
-                <w:lang w:val="hu-HU"/>
-              </w:rPr>
-              <w:t>A berendezés üzemszerű használata és rendszeres karbantartása esetén a balesetveszély csökkentésére tett intézkedések megfelelők. Villamos szereléseket csak az arra feljogosított szerelő végezhet.</w:t>
-            </w:r>
-          </w:p>
-          <w:p>
-            <w:pPr>
-              <w:ind w:left="135"/>
-              <w:rPr>
-                <w:lang w:val="hu-HU"/>
-              </w:rPr>
-            </w:pPr>
+              <w:pStyle w:val="HTML-kntformzott"/>
+              <w:rPr>
+                <w:lang w:val="hu-HU"/>
+              </w:rPr>
+            </w:pPr>
+            <w:r>
+              <w:rPr>
+                <w:lang w:val="hu-HU"/>
+              </w:rPr>
+              <w:t>{{</w:t>
+            </w:r>
+            <w:r>
+              <w:rPr>
+                <w:rFonts w:ascii="Cascadia Mono" w:hAnsi="Cascadia Mono"/>
+                <w:color w:val="0000FF"/>
+                <w:sz w:val="18"/>
+                <w:szCs w:val="18"/>
+              </w:rPr>
+              <w:t>Ellen7_Balesetvédelem</w:t>
+            </w:r>
+            <w:r>
+              <w:rPr>
+                <w:lang w:val="hu-HU"/>
+              </w:rPr>
+              <w:t>}}</w:t>
+            </w:r>
           </w:p>
         </w:tc>
       </w:tr>
       <w:tr>
         <w:trPr>
-          <w:trHeight w:val="1247"/>
+          <w:trHeight w:val="1393"/>
           <w:jc w:val="center"/>
         </w:trPr>
         <w:tc>
@@ -27446,23 +27384,38 @@
           </w:tcPr>
           <w:p>
             <w:pPr>
-              <w:ind w:left="135"/>
-              <w:rPr>
-                <w:lang w:val="hu-HU"/>
-              </w:rPr>
-            </w:pPr>
-            <w:r>
-              <w:rPr>
-                <w:lang w:val="hu-HU"/>
-              </w:rPr>
-              <w:t>Kielégítő</w:t>
+              <w:pStyle w:val="HTML-kntformzott"/>
+              <w:rPr>
+                <w:lang w:val="hu-HU"/>
+              </w:rPr>
+            </w:pPr>
+            <w:r>
+              <w:rPr>
+                <w:lang w:val="hu-HU"/>
+              </w:rPr>
+              <w:t>{{</w:t>
+            </w:r>
+            <w:r>
+              <w:rPr>
+                <w:rFonts w:ascii="Cascadia Mono" w:hAnsi="Cascadia Mono"/>
+                <w:color w:val="0000FF"/>
+                <w:sz w:val="18"/>
+                <w:szCs w:val="18"/>
+              </w:rPr>
+              <w:t>Ellen7_TulaAramvedelem</w:t>
+            </w:r>
+            <w:r>
+              <w:rPr>
+                <w:lang w:val="hu-HU"/>
+              </w:rPr>
+              <w:t>}}</w:t>
             </w:r>
           </w:p>
         </w:tc>
       </w:tr>
       <w:tr>
         <w:trPr>
-          <w:trHeight w:val="1247"/>
+          <w:trHeight w:val="1113"/>
           <w:jc w:val="center"/>
         </w:trPr>
         <w:tc>
@@ -27504,23 +27457,41 @@
           </w:tcPr>
           <w:p>
             <w:pPr>
-              <w:ind w:left="135"/>
-              <w:rPr>
-                <w:lang w:val="hu-HU"/>
-              </w:rPr>
-            </w:pPr>
-            <w:r>
-              <w:rPr>
-                <w:lang w:val="hu-HU"/>
-              </w:rPr>
-              <w:t>-</w:t>
+              <w:pStyle w:val="HTML-kntformzott"/>
+              <w:rPr>
+                <w:rFonts w:ascii="Cascadia Mono" w:hAnsi="Cascadia Mono"/>
+                <w:color w:val="000000"/>
+                <w:sz w:val="18"/>
+                <w:szCs w:val="18"/>
+              </w:rPr>
+            </w:pPr>
+            <w:r>
+              <w:rPr>
+                <w:lang w:val="hu-HU"/>
+              </w:rPr>
+              <w:t>{{</w:t>
+            </w:r>
+            <w:r>
+              <w:rPr>
+                <w:rFonts w:ascii="Cascadia Mono" w:hAnsi="Cascadia Mono"/>
+                <w:color w:val="0000FF"/>
+                <w:sz w:val="18"/>
+                <w:szCs w:val="18"/>
+              </w:rPr>
+              <w:t>Ellen7_AramutesElleni</w:t>
+            </w:r>
+            <w:r>
+              <w:rPr>
+                <w:lang w:val="hu-HU"/>
+              </w:rPr>
+              <w:t>}}</w:t>
             </w:r>
           </w:p>
         </w:tc>
       </w:tr>
       <w:tr>
         <w:trPr>
-          <w:trHeight w:val="1247"/>
+          <w:trHeight w:val="944"/>
           <w:jc w:val="center"/>
         </w:trPr>
         <w:tc>
@@ -27562,23 +27533,38 @@
           </w:tcPr>
           <w:p>
             <w:pPr>
-              <w:ind w:left="135"/>
-              <w:rPr>
-                <w:lang w:val="hu-HU"/>
-              </w:rPr>
-            </w:pPr>
-            <w:r>
-              <w:rPr>
-                <w:lang w:val="hu-HU"/>
-              </w:rPr>
-              <w:t>-</w:t>
+              <w:pStyle w:val="HTML-kntformzott"/>
+              <w:rPr>
+                <w:lang w:val="hu-HU"/>
+              </w:rPr>
+            </w:pPr>
+            <w:r>
+              <w:rPr>
+                <w:lang w:val="hu-HU"/>
+              </w:rPr>
+              <w:t>{{</w:t>
+            </w:r>
+            <w:r>
+              <w:rPr>
+                <w:rFonts w:ascii="Cascadia Mono" w:hAnsi="Cascadia Mono"/>
+                <w:color w:val="0000FF"/>
+                <w:sz w:val="18"/>
+                <w:szCs w:val="18"/>
+              </w:rPr>
+              <w:t>Ellen7_Villamvedelem</w:t>
+            </w:r>
+            <w:r>
+              <w:rPr>
+                <w:lang w:val="hu-HU"/>
+              </w:rPr>
+              <w:t>}}</w:t>
             </w:r>
           </w:p>
         </w:tc>
       </w:tr>
       <w:tr>
         <w:trPr>
-          <w:trHeight w:val="1247"/>
+          <w:trHeight w:val="984"/>
           <w:jc w:val="center"/>
         </w:trPr>
         <w:tc>
@@ -27620,23 +27606,38 @@
           </w:tcPr>
           <w:p>
             <w:pPr>
-              <w:ind w:left="135"/>
-              <w:rPr>
-                <w:lang w:val="hu-HU"/>
-              </w:rPr>
-            </w:pPr>
-            <w:r>
-              <w:rPr>
-                <w:lang w:val="hu-HU"/>
-              </w:rPr>
-              <w:t>Nem része a felülvizsgálatnak</w:t>
+              <w:pStyle w:val="HTML-kntformzott"/>
+              <w:rPr>
+                <w:lang w:val="hu-HU"/>
+              </w:rPr>
+            </w:pPr>
+            <w:r>
+              <w:rPr>
+                <w:lang w:val="hu-HU"/>
+              </w:rPr>
+              <w:t>{{</w:t>
+            </w:r>
+            <w:r>
+              <w:rPr>
+                <w:rFonts w:ascii="Cascadia Mono" w:hAnsi="Cascadia Mono"/>
+                <w:color w:val="0000FF"/>
+                <w:sz w:val="18"/>
+                <w:szCs w:val="18"/>
+              </w:rPr>
+              <w:t>Ellen7_Tulfeszultseg</w:t>
+            </w:r>
+            <w:r>
+              <w:rPr>
+                <w:lang w:val="hu-HU"/>
+              </w:rPr>
+              <w:t>}}</w:t>
             </w:r>
           </w:p>
         </w:tc>
       </w:tr>
       <w:tr>
         <w:trPr>
-          <w:trHeight w:val="1247"/>
+          <w:trHeight w:val="1407"/>
           <w:jc w:val="center"/>
         </w:trPr>
         <w:tc>
@@ -27678,23 +27679,38 @@
           </w:tcPr>
           <w:p>
             <w:pPr>
-              <w:ind w:left="135"/>
-              <w:rPr>
-                <w:lang w:val="hu-HU"/>
-              </w:rPr>
-            </w:pPr>
-            <w:r>
-              <w:rPr>
-                <w:lang w:val="hu-HU"/>
-              </w:rPr>
-              <w:t>Megfelelő</w:t>
+              <w:pStyle w:val="HTML-kntformzott"/>
+              <w:rPr>
+                <w:lang w:val="hu-HU"/>
+              </w:rPr>
+            </w:pPr>
+            <w:r>
+              <w:rPr>
+                <w:lang w:val="hu-HU"/>
+              </w:rPr>
+              <w:t>{{</w:t>
+            </w:r>
+            <w:r>
+              <w:rPr>
+                <w:rFonts w:ascii="Cascadia Mono" w:hAnsi="Cascadia Mono"/>
+                <w:color w:val="0000FF"/>
+                <w:sz w:val="18"/>
+                <w:szCs w:val="18"/>
+              </w:rPr>
+              <w:t>Ellen7_Feszultsegcsokkenes</w:t>
+            </w:r>
+            <w:r>
+              <w:rPr>
+                <w:lang w:val="hu-HU"/>
+              </w:rPr>
+              <w:t>}}</w:t>
             </w:r>
           </w:p>
         </w:tc>
       </w:tr>
       <w:tr>
         <w:trPr>
-          <w:trHeight w:val="1247"/>
+          <w:trHeight w:val="1255"/>
           <w:jc w:val="center"/>
         </w:trPr>
         <w:tc>
@@ -27736,23 +27752,38 @@
           </w:tcPr>
           <w:p>
             <w:pPr>
-              <w:ind w:left="135"/>
-              <w:rPr>
-                <w:lang w:val="hu-HU"/>
-              </w:rPr>
-            </w:pPr>
-            <w:r>
-              <w:rPr>
-                <w:lang w:val="hu-HU"/>
-              </w:rPr>
-              <w:t>Nem része a felülvizsgálatnak</w:t>
+              <w:pStyle w:val="HTML-kntformzott"/>
+              <w:rPr>
+                <w:lang w:val="hu-HU"/>
+              </w:rPr>
+            </w:pPr>
+            <w:r>
+              <w:rPr>
+                <w:lang w:val="hu-HU"/>
+              </w:rPr>
+              <w:t>{{</w:t>
+            </w:r>
+            <w:r>
+              <w:rPr>
+                <w:rFonts w:ascii="Cascadia Mono" w:hAnsi="Cascadia Mono"/>
+                <w:color w:val="0000FF"/>
+                <w:sz w:val="18"/>
+                <w:szCs w:val="18"/>
+              </w:rPr>
+              <w:t>Ellen7_Elektrosztatikus</w:t>
+            </w:r>
+            <w:r>
+              <w:rPr>
+                <w:lang w:val="hu-HU"/>
+              </w:rPr>
+              <w:t>}}</w:t>
             </w:r>
           </w:p>
         </w:tc>
       </w:tr>
       <w:tr>
         <w:trPr>
-          <w:trHeight w:val="1247"/>
+          <w:trHeight w:val="1129"/>
           <w:jc w:val="center"/>
         </w:trPr>
         <w:tc>
@@ -27794,16 +27825,31 @@
           </w:tcPr>
           <w:p>
             <w:pPr>
-              <w:ind w:left="135"/>
-              <w:rPr>
-                <w:lang w:val="hu-HU"/>
-              </w:rPr>
-            </w:pPr>
-            <w:r>
-              <w:rPr>
-                <w:lang w:val="hu-HU"/>
-              </w:rPr>
-              <w:t>-</w:t>
+              <w:pStyle w:val="HTML-kntformzott"/>
+              <w:rPr>
+                <w:lang w:val="hu-HU"/>
+              </w:rPr>
+            </w:pPr>
+            <w:r>
+              <w:rPr>
+                <w:lang w:val="hu-HU"/>
+              </w:rPr>
+              <w:t>{{</w:t>
+            </w:r>
+            <w:r>
+              <w:rPr>
+                <w:rFonts w:ascii="Cascadia Mono" w:hAnsi="Cascadia Mono"/>
+                <w:color w:val="0000FF"/>
+                <w:sz w:val="18"/>
+                <w:szCs w:val="18"/>
+              </w:rPr>
+              <w:t>Ellen7_Megjegyzes</w:t>
+            </w:r>
+            <w:r>
+              <w:rPr>
+                <w:lang w:val="hu-HU"/>
+              </w:rPr>
+              <w:t>}}</w:t>
             </w:r>
           </w:p>
         </w:tc>
@@ -27852,16 +27898,33 @@
           </w:tcPr>
           <w:p>
             <w:pPr>
-              <w:ind w:left="135"/>
-              <w:rPr>
-                <w:lang w:val="hu-HU"/>
-              </w:rPr>
-            </w:pPr>
-            <w:r>
-              <w:rPr>
-                <w:lang w:val="hu-HU"/>
-              </w:rPr>
-              <w:t>Megfelelő.</w:t>
+              <w:pStyle w:val="HTML-kntformzott"/>
+              <w:rPr>
+                <w:lang w:val="hu-HU"/>
+              </w:rPr>
+            </w:pPr>
+            <w:r>
+              <w:rPr>
+                <w:lang w:val="hu-HU"/>
+              </w:rPr>
+              <w:t>{{</w:t>
+            </w:r>
+            <w:r>
+              <w:rPr>
+                <w:rFonts w:ascii="Cascadia Mono" w:hAnsi="Cascadia Mono"/>
+                <w:color w:val="0000FF"/>
+                <w:sz w:val="18"/>
+                <w:szCs w:val="18"/>
+              </w:rPr>
+              <w:t>Ellen7_AtfogoErtekeles</w:t>
+            </w:r>
+            <w:bookmarkStart w:id="2" w:name="_GoBack"/>
+            <w:bookmarkEnd w:id="2"/>
+            <w:r>
+              <w:rPr>
+                <w:lang w:val="hu-HU"/>
+              </w:rPr>
+              <w:t>}}</w:t>
             </w:r>
           </w:p>
         </w:tc>

</xml_diff>

<commit_message>
Navigáció és idpszakos felülvizsgálat
</commit_message>
<xml_diff>
--- a/BiztvillCRM.Web/wwwroot/sablonok/VBF_KIF_MINTA.docx
+++ b/BiztvillCRM.Web/wwwroot/sablonok/VBF_KIF_MINTA.docx
@@ -132,7 +132,7 @@
               <w:bottom w:val="nil"/>
               <w:right w:val="nil"/>
             </w:tcBorders>
-            <w:vAlign w:val="bottom"/>
+            <w:vAlign w:val="center"/>
           </w:tcPr>
           <w:p>
             <w:pPr>
@@ -215,7 +215,7 @@
               <w:bottom w:val="nil"/>
               <w:right w:val="nil"/>
             </w:tcBorders>
-            <w:vAlign w:val="bottom"/>
+            <w:vAlign w:val="center"/>
           </w:tcPr>
           <w:p>
             <w:pPr>
@@ -322,7 +322,7 @@
               <w:bottom w:val="nil"/>
               <w:right w:val="nil"/>
             </w:tcBorders>
-            <w:vAlign w:val="bottom"/>
+            <w:vAlign w:val="center"/>
           </w:tcPr>
           <w:p>
             <w:pPr>
@@ -399,7 +399,7 @@
               <w:bottom w:val="nil"/>
               <w:right w:val="nil"/>
             </w:tcBorders>
-            <w:vAlign w:val="bottom"/>
+            <w:vAlign w:val="center"/>
           </w:tcPr>
           <w:p>
             <w:pPr>
@@ -483,7 +483,7 @@
               <w:bottom w:val="nil"/>
               <w:right w:val="nil"/>
             </w:tcBorders>
-            <w:vAlign w:val="bottom"/>
+            <w:vAlign w:val="center"/>
           </w:tcPr>
           <w:p>
             <w:pPr>
@@ -590,7 +590,7 @@
               <w:bottom w:val="nil"/>
               <w:right w:val="nil"/>
             </w:tcBorders>
-            <w:vAlign w:val="bottom"/>
+            <w:vAlign w:val="center"/>
           </w:tcPr>
           <w:p>
             <w:pPr>
@@ -688,7 +688,7 @@
               <w:bottom w:val="nil"/>
               <w:right w:val="nil"/>
             </w:tcBorders>
-            <w:vAlign w:val="bottom"/>
+            <w:vAlign w:val="center"/>
           </w:tcPr>
           <w:p>
             <w:pPr>
@@ -786,7 +786,7 @@
               <w:bottom w:val="nil"/>
               <w:right w:val="nil"/>
             </w:tcBorders>
-            <w:vAlign w:val="bottom"/>
+            <w:vAlign w:val="center"/>
           </w:tcPr>
           <w:p>
             <w:pPr>
@@ -863,7 +863,7 @@
               <w:bottom w:val="nil"/>
               <w:right w:val="nil"/>
             </w:tcBorders>
-            <w:vAlign w:val="bottom"/>
+            <w:vAlign w:val="center"/>
           </w:tcPr>
           <w:p>
             <w:pPr>
@@ -970,7 +970,7 @@
               <w:bottom w:val="nil"/>
               <w:right w:val="nil"/>
             </w:tcBorders>
-            <w:vAlign w:val="bottom"/>
+            <w:vAlign w:val="center"/>
           </w:tcPr>
           <w:p>
             <w:pPr>
@@ -1062,7 +1062,7 @@
               <w:bottom w:val="nil"/>
               <w:right w:val="nil"/>
             </w:tcBorders>
-            <w:vAlign w:val="bottom"/>
+            <w:vAlign w:val="center"/>
           </w:tcPr>
           <w:p>
             <w:pPr>
@@ -2552,12 +2552,12 @@
               <w:bottom w:val="nil"/>
               <w:right w:val="single" w:sz="12" w:space="0" w:color="auto"/>
             </w:tcBorders>
+            <w:vAlign w:val="center"/>
           </w:tcPr>
           <w:p>
             <w:pPr>
               <w:spacing w:line="360" w:lineRule="auto"/>
               <w:ind w:left="411" w:right="563"/>
-              <w:jc w:val="both"/>
               <w:rPr>
                 <w:rFonts w:eastAsia="Arial" w:cs="Segoe UI"/>
                 <w:sz w:val="24"/>
@@ -4050,6 +4050,7 @@
               <w:bottom w:val="nil"/>
               <w:right w:val="single" w:sz="12" w:space="0" w:color="auto"/>
             </w:tcBorders>
+            <w:vAlign w:val="center"/>
           </w:tcPr>
           <w:p>
             <w:pPr>
@@ -4292,6 +4293,7 @@
               <w:bottom w:val="nil"/>
               <w:right w:val="single" w:sz="12" w:space="0" w:color="auto"/>
             </w:tcBorders>
+            <w:vAlign w:val="center"/>
           </w:tcPr>
           <w:p>
             <w:pPr>
@@ -7572,14 +7574,7 @@
           </w:p>
           <w:p>
             <w:pPr>
-              <w:pStyle w:val="Listaszerbekezds"/>
-              <w:numPr>
-                <w:ilvl w:val="0"/>
-                <w:numId w:val="7"/>
-              </w:numPr>
-              <w:spacing w:line="276" w:lineRule="auto"/>
-              <w:ind w:right="550"/>
-              <w:jc w:val="both"/>
+              <w:pStyle w:val="HTML-kntformzott"/>
               <w:rPr>
                 <w:u w:val="single"/>
               </w:rPr>
@@ -7597,15 +7592,28 @@
                 <w:b/>
                 <w:highlight w:val="yellow"/>
               </w:rPr>
-              <w:t>202</w:t>
-            </w:r>
+              <w:t>{{</w:t>
+            </w:r>
+            <w:proofErr w:type="spellStart"/>
+            <w:r>
+              <w:rPr>
+                <w:rFonts w:ascii="Cascadia Mono" w:hAnsi="Cascadia Mono"/>
+                <w:color w:val="0000FF"/>
+                <w:sz w:val="18"/>
+                <w:szCs w:val="18"/>
+              </w:rPr>
+              <w:t>kovetkezo_felulvizsgalat</w:t>
+            </w:r>
+            <w:bookmarkStart w:id="0" w:name="_GoBack"/>
+            <w:bookmarkEnd w:id="0"/>
+            <w:proofErr w:type="spellEnd"/>
             <w:r>
               <w:rPr>
                 <w:rFonts w:eastAsia="Verdana"/>
                 <w:b/>
                 <w:highlight w:val="yellow"/>
               </w:rPr>
-              <w:t>9</w:t>
+              <w:t>}}</w:t>
             </w:r>
             <w:r>
               <w:rPr>
@@ -7613,47 +7621,25 @@
                 <w:b/>
                 <w:highlight w:val="yellow"/>
               </w:rPr>
-              <w:t>.</w:t>
-            </w:r>
+              <w:t>-</w:t>
+            </w:r>
+            <w:proofErr w:type="spellStart"/>
             <w:r>
               <w:rPr>
                 <w:rFonts w:eastAsia="Verdana"/>
                 <w:b/>
                 <w:highlight w:val="yellow"/>
               </w:rPr>
-              <w:t>02</w:t>
-            </w:r>
+              <w:t>ig</w:t>
+            </w:r>
+            <w:proofErr w:type="spellEnd"/>
             <w:r>
               <w:rPr>
                 <w:rFonts w:eastAsia="Verdana"/>
                 <w:b/>
                 <w:highlight w:val="yellow"/>
               </w:rPr>
-              <w:t>.</w:t>
-            </w:r>
-            <w:r>
-              <w:rPr>
-                <w:rFonts w:eastAsia="Verdana"/>
-                <w:b/>
-                <w:highlight w:val="yellow"/>
-              </w:rPr>
-              <w:t>26</w:t>
-            </w:r>
-            <w:r>
-              <w:rPr>
-                <w:rFonts w:eastAsia="Verdana"/>
-                <w:b/>
-                <w:highlight w:val="yellow"/>
-              </w:rPr>
-              <w:t>-</w:t>
-            </w:r>
-            <w:r>
-              <w:rPr>
-                <w:rFonts w:eastAsia="Verdana"/>
-                <w:b/>
-                <w:highlight w:val="yellow"/>
-              </w:rPr>
-              <w:t>ig, vagy a berendezésen történt első</w:t>
+              <w:t>, vagy a berendezésen történt első</w:t>
             </w:r>
             <w:r>
               <w:rPr>
@@ -12073,19 +12059,7 @@
                 <w:szCs w:val="18"/>
                 <w:lang w:eastAsia="hu-HU"/>
               </w:rPr>
-              <w:t>sza</w:t>
-            </w:r>
-            <w:bookmarkStart w:id="0" w:name="_GoBack"/>
-            <w:bookmarkEnd w:id="0"/>
-            <w:r>
-              <w:rPr>
-                <w:rFonts w:ascii="Cascadia Mono" w:hAnsi="Cascadia Mono" w:cs="Courier New"/>
-                <w:color w:val="000000"/>
-                <w:sz w:val="18"/>
-                <w:szCs w:val="18"/>
-                <w:lang w:eastAsia="hu-HU"/>
-              </w:rPr>
-              <w:t>bvanyok.</w:t>
+              <w:t>szabvanyok.</w:t>
             </w:r>
             <w:r>
               <w:rPr>
@@ -12168,17 +12142,7 @@
                 <w:szCs w:val="18"/>
                 <w:lang w:eastAsia="hu-HU"/>
               </w:rPr>
-              <w:t>szabvanyok.sz_</w:t>
-            </w:r>
-            <w:r>
-              <w:rPr>
-                <w:rFonts w:ascii="Cascadia Mono" w:hAnsi="Cascadia Mono" w:cs="Courier New"/>
-                <w:color w:val="000000"/>
-                <w:sz w:val="18"/>
-                <w:szCs w:val="18"/>
-                <w:lang w:eastAsia="hu-HU"/>
-              </w:rPr>
-              <w:t>2</w:t>
+              <w:t>szabvanyok.sz_2</w:t>
             </w:r>
             <w:r>
               <w:rPr>
@@ -12248,17 +12212,7 @@
                 <w:szCs w:val="18"/>
                 <w:lang w:eastAsia="hu-HU"/>
               </w:rPr>
-              <w:t>szabvanyok.sz_</w:t>
-            </w:r>
-            <w:r>
-              <w:rPr>
-                <w:rFonts w:ascii="Cascadia Mono" w:hAnsi="Cascadia Mono" w:cs="Courier New"/>
-                <w:color w:val="000000"/>
-                <w:sz w:val="18"/>
-                <w:szCs w:val="18"/>
-                <w:lang w:eastAsia="hu-HU"/>
-              </w:rPr>
-              <w:t>3</w:t>
+              <w:t>szabvanyok.sz_3</w:t>
             </w:r>
             <w:r>
               <w:rPr>

</xml_diff>